<commit_message>
Reformatea los PDF de Delante de mí y Espirar/Expirar con el estilo estándar
Añade la cabecera con logo, el pie de página y la maquetación maroon/dorado/
crema/azul marino que usan el resto de guías descargables (banner de portada
centrado, barras de sección, cabeceras de tabla y cajas de aviso), en vez del
formato negro/naranja que tenían. Contenido sin cambios, verificado (páginas,
tamaño A4, sin glifos rotos, sin enlaces rotos).

Co-Authored-By: Claude Sonnet 5 <noreply@anthropic.com>
</commit_message>
<xml_diff>
--- a/DESCARGABLES_PDF/DELANTE_DE_MI/DELANTE_DE_MI_DESCARGABLE.docx
+++ b/DESCARGABLES_PDF/DELANTE_DE_MI/DELANTE_DE_MI_DESCARGABLE.docx
@@ -16,21 +16,24 @@
         <w:tc>
           <w:tcPr>
             <w:tcW w:type="dxa" w:w="10086"/>
-            <w:shd w:val="clear" w:color="auto" w:fill="C0392B"/>
             <w:tcBorders>
               <w:top w:val="single" w:sz="6" w:space="0" w:color="C0392B"/>
               <w:left w:val="single" w:sz="6" w:space="0" w:color="C0392B"/>
               <w:bottom w:val="single" w:sz="6" w:space="0" w:color="C0392B"/>
               <w:right w:val="single" w:sz="6" w:space="0" w:color="C0392B"/>
             </w:tcBorders>
+            <w:shd w:val="clear" w:color="auto" w:fill="7B1D1D"/>
           </w:tcPr>
           <w:p>
+            <w:pPr>
+              <w:jc w:val="center"/>
+            </w:pPr>
             <w:r/>
           </w:p>
           <w:p>
             <w:pPr>
               <w:spacing w:after="80" w:before="0"/>
-              <w:jc w:val="left"/>
+              <w:jc w:val="center"/>
             </w:pPr>
             <w:r>
               <w:rPr>
@@ -46,14 +49,14 @@
           <w:p>
             <w:pPr>
               <w:spacing w:after="0" w:before="0"/>
-              <w:jc w:val="left"/>
+              <w:jc w:val="center"/>
             </w:pPr>
             <w:r>
               <w:rPr>
                 <w:rFonts w:ascii="Calibri" w:hAnsi="Calibri"/>
                 <w:b/>
                 <w:i w:val="0"/>
-                <w:color w:val="FFFFFF"/>
+                <w:color w:val="FFC000"/>
                 <w:sz w:val="44"/>
               </w:rPr>
               <w:t>¿"Delante mía" o</w:t>
@@ -62,14 +65,14 @@
           <w:p>
             <w:pPr>
               <w:spacing w:after="0" w:before="0"/>
-              <w:jc w:val="left"/>
+              <w:jc w:val="center"/>
             </w:pPr>
             <w:r>
               <w:rPr>
                 <w:rFonts w:ascii="Calibri" w:hAnsi="Calibri"/>
                 <w:b/>
                 <w:i w:val="0"/>
-                <w:color w:val="FFFFFF"/>
+                <w:color w:val="FFC000"/>
                 <w:sz w:val="44"/>
               </w:rPr>
               <w:t>"delante de mí"?</w:t>
@@ -78,7 +81,7 @@
           <w:p>
             <w:pPr>
               <w:spacing w:after="80" w:before="120"/>
-              <w:jc w:val="left"/>
+              <w:jc w:val="center"/>
             </w:pPr>
             <w:r>
               <w:rPr>
@@ -94,7 +97,7 @@
           <w:p>
             <w:pPr>
               <w:spacing w:after="0" w:before="0"/>
-              <w:jc w:val="left"/>
+              <w:jc w:val="center"/>
             </w:pPr>
             <w:r>
               <w:rPr>
@@ -129,7 +132,7 @@
         <w:tc>
           <w:tcPr>
             <w:tcW w:type="dxa" w:w="10086"/>
-            <w:shd w:val="clear" w:color="auto" w:fill="F4F4F6"/>
+            <w:shd w:val="clear" w:color="auto" w:fill="F5F0E5"/>
             <w:tcBorders>
               <w:top w:val="single" w:sz="6" w:space="0" w:color="DDDDDD"/>
               <w:left w:val="single" w:sz="6" w:space="0" w:color="DDDDDD"/>
@@ -150,7 +153,7 @@
                 <w:rFonts w:ascii="Calibri" w:hAnsi="Calibri"/>
                 <w:b/>
                 <w:i w:val="0"/>
-                <w:color w:val="121117"/>
+                <w:color w:val="1A1A1A"/>
                 <w:sz w:val="20"/>
               </w:rPr>
               <w:t>¡Bienvenido/a! · Welcome · 欢迎 · ようこそ · Bienvenue.</w:t>
@@ -166,7 +169,7 @@
                 <w:rFonts w:ascii="Calibri" w:hAnsi="Calibri"/>
                 <w:b w:val="0"/>
                 <w:i w:val="0"/>
-                <w:color w:val="4D4C5C"/>
+                <w:color w:val="666666"/>
                 <w:sz w:val="20"/>
               </w:rPr>
               <w:t>This free guide covers the short video you just watched: why “delante mía / detrás mío” is not careful Spanish. You will learn the rule (adverb + de + pronoun), the full list of adverbs affected, and the few cases where a possessive really is correct.</w:t>
@@ -194,7 +197,7 @@
         <w:tc>
           <w:tcPr>
             <w:tcW w:type="dxa" w:w="10086"/>
-            <w:shd w:val="clear" w:color="auto" w:fill="FBF1DE"/>
+            <w:shd w:val="clear" w:color="auto" w:fill="F4F1EA"/>
             <w:tcBorders>
               <w:top w:val="single" w:sz="6" w:space="0" w:color="DDDDDD"/>
               <w:left w:val="single" w:sz="6" w:space="0" w:color="DDDDDD"/>
@@ -215,7 +218,7 @@
                 <w:rFonts w:ascii="Calibri" w:hAnsi="Calibri"/>
                 <w:b/>
                 <w:i w:val="0"/>
-                <w:color w:val="D4920A"/>
+                <w:color w:val="C89B3C"/>
                 <w:sz w:val="20"/>
               </w:rPr>
               <w:t>Objetivo de la lección.</w:t>
@@ -231,7 +234,7 @@
                 <w:rFonts w:ascii="Calibri" w:hAnsi="Calibri"/>
                 <w:b w:val="0"/>
                 <w:i w:val="0"/>
-                <w:color w:val="4D4C5C"/>
+                <w:color w:val="666666"/>
                 <w:sz w:val="20"/>
               </w:rPr>
               <w:t>Al terminar esta lección podrás: (1) reconocer que delante, detrás, encima, cerca… son adverbios y no admiten posesivo; (2) usar la estructura correcta «adverbio + de + pronombre» (delante de mí); (3) evitar sobre todo la forma femenina («delante mía»); (4) distinguir los casos en los que el posesivo sí es correcto (en mi contra, a mi favor).</w:t>
@@ -259,7 +262,7 @@
         <w:tc>
           <w:tcPr>
             <w:tcW w:type="dxa" w:w="10086"/>
-            <w:shd w:val="clear" w:color="auto" w:fill="121117"/>
+            <w:shd w:val="clear" w:color="auto" w:fill="7B1D1D"/>
             <w:tcBorders>
               <w:top w:val="single" w:sz="6" w:space="0" w:color="121117"/>
               <w:left w:val="single" w:sz="6" w:space="0" w:color="121117"/>
@@ -309,7 +312,7 @@
         <w:tc>
           <w:tcPr>
             <w:tcW w:type="dxa" w:w="680"/>
-            <w:shd w:val="clear" w:color="auto" w:fill="D4920A"/>
+            <w:shd w:val="clear" w:color="auto" w:fill="1F2A44"/>
           </w:tcPr>
           <w:p>
             <w:r/>
@@ -324,7 +327,7 @@
                 <w:rFonts w:ascii="Calibri" w:hAnsi="Calibri"/>
                 <w:b/>
                 <w:i w:val="0"/>
-                <w:color w:val="121117"/>
+                <w:color w:val="1A1A1A"/>
                 <w:sz w:val="19"/>
               </w:rPr>
               <w:t>#</w:t>
@@ -334,7 +337,7 @@
         <w:tc>
           <w:tcPr>
             <w:tcW w:type="dxa" w:w="8220"/>
-            <w:shd w:val="clear" w:color="auto" w:fill="D4920A"/>
+            <w:shd w:val="clear" w:color="auto" w:fill="1F2A44"/>
           </w:tcPr>
           <w:p>
             <w:r/>
@@ -349,7 +352,7 @@
                 <w:rFonts w:ascii="Calibri" w:hAnsi="Calibri"/>
                 <w:b/>
                 <w:i w:val="0"/>
-                <w:color w:val="121117"/>
+                <w:color w:val="1A1A1A"/>
                 <w:sz w:val="19"/>
               </w:rPr>
               <w:t>Sección</w:t>
@@ -375,7 +378,7 @@
                 <w:rFonts w:ascii="Calibri" w:hAnsi="Calibri"/>
                 <w:b w:val="0"/>
                 <w:i w:val="0"/>
-                <w:color w:val="121117"/>
+                <w:color w:val="1A1A1A"/>
                 <w:sz w:val="20"/>
               </w:rPr>
               <w:t>01</w:t>
@@ -399,7 +402,7 @@
                 <w:rFonts w:ascii="Calibri" w:hAnsi="Calibri"/>
                 <w:b w:val="0"/>
                 <w:i w:val="0"/>
-                <w:color w:val="121117"/>
+                <w:color w:val="1A1A1A"/>
                 <w:sz w:val="20"/>
               </w:rPr>
               <w:t>«Delante mía» y el error más común</w:t>
@@ -425,7 +428,7 @@
                 <w:rFonts w:ascii="Calibri" w:hAnsi="Calibri"/>
                 <w:b w:val="0"/>
                 <w:i w:val="0"/>
-                <w:color w:val="121117"/>
+                <w:color w:val="1A1A1A"/>
                 <w:sz w:val="20"/>
               </w:rPr>
               <w:t>02</w:t>
@@ -449,7 +452,7 @@
                 <w:rFonts w:ascii="Calibri" w:hAnsi="Calibri"/>
                 <w:b w:val="0"/>
                 <w:i w:val="0"/>
-                <w:color w:val="121117"/>
+                <w:color w:val="1A1A1A"/>
                 <w:sz w:val="20"/>
               </w:rPr>
               <w:t>La lista — adverbios de lugar que no admiten posesivo</w:t>
@@ -475,7 +478,7 @@
                 <w:rFonts w:ascii="Calibri" w:hAnsi="Calibri"/>
                 <w:b w:val="0"/>
                 <w:i w:val="0"/>
-                <w:color w:val="121117"/>
+                <w:color w:val="1A1A1A"/>
                 <w:sz w:val="20"/>
               </w:rPr>
               <w:t>03</w:t>
@@ -499,7 +502,7 @@
                 <w:rFonts w:ascii="Calibri" w:hAnsi="Calibri"/>
                 <w:b w:val="0"/>
                 <w:i w:val="0"/>
-                <w:color w:val="121117"/>
+                <w:color w:val="1A1A1A"/>
                 <w:sz w:val="20"/>
               </w:rPr>
               <w:t>Cuándo el posesivo SÍ es correcto</w:t>
@@ -525,7 +528,7 @@
                 <w:rFonts w:ascii="Calibri" w:hAnsi="Calibri"/>
                 <w:b w:val="0"/>
                 <w:i w:val="0"/>
-                <w:color w:val="121117"/>
+                <w:color w:val="1A1A1A"/>
                 <w:sz w:val="20"/>
               </w:rPr>
               <w:t>04</w:t>
@@ -549,7 +552,7 @@
                 <w:rFonts w:ascii="Calibri" w:hAnsi="Calibri"/>
                 <w:b w:val="0"/>
                 <w:i w:val="0"/>
-                <w:color w:val="121117"/>
+                <w:color w:val="1A1A1A"/>
                 <w:sz w:val="20"/>
               </w:rPr>
               <w:t>Corrige el error — ✗ incorrecto → ✓ correcto</w:t>
@@ -575,7 +578,7 @@
                 <w:rFonts w:ascii="Calibri" w:hAnsi="Calibri"/>
                 <w:b w:val="0"/>
                 <w:i w:val="0"/>
-                <w:color w:val="121117"/>
+                <w:color w:val="1A1A1A"/>
                 <w:sz w:val="20"/>
               </w:rPr>
               <w:t>05</w:t>
@@ -599,7 +602,7 @@
                 <w:rFonts w:ascii="Calibri" w:hAnsi="Calibri"/>
                 <w:b w:val="0"/>
                 <w:i w:val="0"/>
-                <w:color w:val="121117"/>
+                <w:color w:val="1A1A1A"/>
                 <w:sz w:val="20"/>
               </w:rPr>
               <w:t>Frases de ejemplo en contexto</w:t>
@@ -625,7 +628,7 @@
                 <w:rFonts w:ascii="Calibri" w:hAnsi="Calibri"/>
                 <w:b w:val="0"/>
                 <w:i w:val="0"/>
-                <w:color w:val="121117"/>
+                <w:color w:val="1A1A1A"/>
                 <w:sz w:val="20"/>
               </w:rPr>
               <w:t>06</w:t>
@@ -649,7 +652,7 @@
                 <w:rFonts w:ascii="Calibri" w:hAnsi="Calibri"/>
                 <w:b w:val="0"/>
                 <w:i w:val="0"/>
-                <w:color w:val="121117"/>
+                <w:color w:val="1A1A1A"/>
                 <w:sz w:val="20"/>
               </w:rPr>
               <w:t>Checklist de autoevaluación</w:t>
@@ -675,7 +678,7 @@
                 <w:rFonts w:ascii="Calibri" w:hAnsi="Calibri"/>
                 <w:b w:val="0"/>
                 <w:i w:val="0"/>
-                <w:color w:val="121117"/>
+                <w:color w:val="1A1A1A"/>
                 <w:sz w:val="20"/>
               </w:rPr>
               <w:t>07</w:t>
@@ -699,7 +702,7 @@
                 <w:rFonts w:ascii="Calibri" w:hAnsi="Calibri"/>
                 <w:b w:val="0"/>
                 <w:i w:val="0"/>
-                <w:color w:val="121117"/>
+                <w:color w:val="1A1A1A"/>
                 <w:sz w:val="20"/>
               </w:rPr>
               <w:t>Practica con IA — 1 prompt listo para usar</w:t>
@@ -725,7 +728,7 @@
                 <w:rFonts w:ascii="Calibri" w:hAnsi="Calibri"/>
                 <w:b w:val="0"/>
                 <w:i w:val="0"/>
-                <w:color w:val="121117"/>
+                <w:color w:val="1A1A1A"/>
                 <w:sz w:val="20"/>
               </w:rPr>
               <w:t>08</w:t>
@@ -749,7 +752,7 @@
                 <w:rFonts w:ascii="Calibri" w:hAnsi="Calibri"/>
                 <w:b w:val="0"/>
                 <w:i w:val="0"/>
-                <w:color w:val="121117"/>
+                <w:color w:val="1A1A1A"/>
                 <w:sz w:val="20"/>
               </w:rPr>
               <w:t>Próximamente — más errores del español hablado</w:t>
@@ -777,7 +780,7 @@
         <w:tc>
           <w:tcPr>
             <w:tcW w:type="dxa" w:w="10086"/>
-            <w:shd w:val="clear" w:color="auto" w:fill="121117"/>
+            <w:shd w:val="clear" w:color="auto" w:fill="7B1D1D"/>
             <w:tcBorders>
               <w:top w:val="single" w:sz="6" w:space="0" w:color="121117"/>
               <w:left w:val="single" w:sz="6" w:space="0" w:color="121117"/>
@@ -822,7 +825,7 @@
           <w:rFonts w:ascii="Calibri" w:hAnsi="Calibri"/>
           <w:b w:val="0"/>
           <w:i w:val="0"/>
-          <w:color w:val="121117"/>
+          <w:color w:val="1A1A1A"/>
           <w:sz w:val="21"/>
         </w:rPr>
         <w:t>«Se ha sentado delante mía». Se oye muchísimo —también a hablantes nativos—, pero en el español estándar y cuidado lo recomendable es «se ha sentado delante de mí». El motivo es gramatical: delante, detrás, cerca, encima, enfrente, lejos… son adverbios, no sustantivos. Y los posesivos (mío, tuyo, suyo, mía…) acompañan a sustantivos —mi casa, un amigo mío—, no a adverbios. Lo correcto es adverbio + de + pronombre tónico: delante de mí, detrás de ti, cerca de él.</w:t>
@@ -838,7 +841,7 @@
           <w:rFonts w:ascii="Calibri" w:hAnsi="Calibri"/>
           <w:b w:val="0"/>
           <w:i w:val="0"/>
-          <w:color w:val="121117"/>
+          <w:color w:val="1A1A1A"/>
           <w:sz w:val="21"/>
         </w:rPr>
         <w:t>La forma en femenino («delante mía», «detrás nuestra») es la menos aconsejable de todas, porque el adverbio no tiene género con el que concordar.</w:t>
@@ -858,7 +861,7 @@
         <w:tc>
           <w:tcPr>
             <w:tcW w:type="dxa" w:w="10086"/>
-            <w:shd w:val="clear" w:color="auto" w:fill="FBF1DE"/>
+            <w:shd w:val="clear" w:color="auto" w:fill="F4F1EA"/>
             <w:tcBorders>
               <w:top w:val="single" w:sz="6" w:space="0" w:color="DDDDDD"/>
               <w:left w:val="single" w:sz="6" w:space="0" w:color="DDDDDD"/>
@@ -879,7 +882,7 @@
                 <w:rFonts w:ascii="Calibri" w:hAnsi="Calibri"/>
                 <w:b/>
                 <w:i w:val="0"/>
-                <w:color w:val="D4920A"/>
+                <w:color w:val="C89B3C"/>
                 <w:sz w:val="20"/>
               </w:rPr>
               <w:t>El truco</w:t>
@@ -895,7 +898,7 @@
                 <w:rFonts w:ascii="Calibri" w:hAnsi="Calibri"/>
                 <w:b w:val="0"/>
                 <w:i w:val="0"/>
-                <w:color w:val="121117"/>
+                <w:color w:val="1A1A1A"/>
                 <w:sz w:val="20"/>
               </w:rPr>
               <w:t>Si puedes decir «delante DE la puerta», di «delante DE mí». El posesivo va con el sustantivo (mi casa); con el adverbio va «de» + pronombre.</w:t>
@@ -939,7 +942,7 @@
         <w:tc>
           <w:tcPr>
             <w:tcW w:type="dxa" w:w="10086"/>
-            <w:shd w:val="clear" w:color="auto" w:fill="121117"/>
+            <w:shd w:val="clear" w:color="auto" w:fill="7B1D1D"/>
             <w:tcBorders>
               <w:top w:val="single" w:sz="6" w:space="0" w:color="121117"/>
               <w:left w:val="single" w:sz="6" w:space="0" w:color="121117"/>
@@ -990,7 +993,7 @@
         <w:tc>
           <w:tcPr>
             <w:tcW w:type="dxa" w:w="1984"/>
-            <w:shd w:val="clear" w:color="auto" w:fill="D4920A"/>
+            <w:shd w:val="clear" w:color="auto" w:fill="1F2A44"/>
           </w:tcPr>
           <w:p>
             <w:r/>
@@ -1005,7 +1008,7 @@
                 <w:rFonts w:ascii="Calibri" w:hAnsi="Calibri"/>
                 <w:b/>
                 <w:i w:val="0"/>
-                <w:color w:val="121117"/>
+                <w:color w:val="1A1A1A"/>
                 <w:sz w:val="19"/>
               </w:rPr>
               <w:t>ADVERBIO</w:t>
@@ -1015,7 +1018,7 @@
         <w:tc>
           <w:tcPr>
             <w:tcW w:type="dxa" w:w="3628"/>
-            <w:shd w:val="clear" w:color="auto" w:fill="D4920A"/>
+            <w:shd w:val="clear" w:color="auto" w:fill="1F2A44"/>
           </w:tcPr>
           <w:p>
             <w:r/>
@@ -1030,7 +1033,7 @@
                 <w:rFonts w:ascii="Calibri" w:hAnsi="Calibri"/>
                 <w:b/>
                 <w:i w:val="0"/>
-                <w:color w:val="121117"/>
+                <w:color w:val="1A1A1A"/>
                 <w:sz w:val="19"/>
               </w:rPr>
               <w:t>FORMA CORRECTA</w:t>
@@ -1040,7 +1043,7 @@
         <w:tc>
           <w:tcPr>
             <w:tcW w:type="dxa" w:w="3288"/>
-            <w:shd w:val="clear" w:color="auto" w:fill="D4920A"/>
+            <w:shd w:val="clear" w:color="auto" w:fill="1F2A44"/>
           </w:tcPr>
           <w:p>
             <w:r/>
@@ -1055,7 +1058,7 @@
                 <w:rFonts w:ascii="Calibri" w:hAnsi="Calibri"/>
                 <w:b/>
                 <w:i w:val="0"/>
-                <w:color w:val="121117"/>
+                <w:color w:val="1A1A1A"/>
                 <w:sz w:val="19"/>
               </w:rPr>
               <w:t>NO DIGAS</w:t>
@@ -1081,7 +1084,7 @@
                 <w:rFonts w:ascii="Calibri" w:hAnsi="Calibri"/>
                 <w:b w:val="0"/>
                 <w:i w:val="0"/>
-                <w:color w:val="121117"/>
+                <w:color w:val="1A1A1A"/>
                 <w:sz w:val="20"/>
               </w:rPr>
               <w:t>delante</w:t>
@@ -1105,7 +1108,7 @@
                 <w:rFonts w:ascii="Calibri" w:hAnsi="Calibri"/>
                 <w:b w:val="0"/>
                 <w:i w:val="0"/>
-                <w:color w:val="121117"/>
+                <w:color w:val="1A1A1A"/>
                 <w:sz w:val="20"/>
               </w:rPr>
               <w:t>delante de mí</w:t>
@@ -1129,7 +1132,7 @@
                 <w:rFonts w:ascii="Calibri" w:hAnsi="Calibri"/>
                 <w:b w:val="0"/>
                 <w:i w:val="0"/>
-                <w:color w:val="121117"/>
+                <w:color w:val="1A1A1A"/>
                 <w:sz w:val="20"/>
               </w:rPr>
               <w:t>delante mío / mía</w:t>
@@ -1155,7 +1158,7 @@
                 <w:rFonts w:ascii="Calibri" w:hAnsi="Calibri"/>
                 <w:b w:val="0"/>
                 <w:i w:val="0"/>
-                <w:color w:val="121117"/>
+                <w:color w:val="1A1A1A"/>
                 <w:sz w:val="20"/>
               </w:rPr>
               <w:t>detrás</w:t>
@@ -1179,7 +1182,7 @@
                 <w:rFonts w:ascii="Calibri" w:hAnsi="Calibri"/>
                 <w:b w:val="0"/>
                 <w:i w:val="0"/>
-                <w:color w:val="121117"/>
+                <w:color w:val="1A1A1A"/>
                 <w:sz w:val="20"/>
               </w:rPr>
               <w:t>detrás de ti</w:t>
@@ -1203,7 +1206,7 @@
                 <w:rFonts w:ascii="Calibri" w:hAnsi="Calibri"/>
                 <w:b w:val="0"/>
                 <w:i w:val="0"/>
-                <w:color w:val="121117"/>
+                <w:color w:val="1A1A1A"/>
                 <w:sz w:val="20"/>
               </w:rPr>
               <w:t>detrás tuyo / tuya</w:t>
@@ -1229,7 +1232,7 @@
                 <w:rFonts w:ascii="Calibri" w:hAnsi="Calibri"/>
                 <w:b w:val="0"/>
                 <w:i w:val="0"/>
-                <w:color w:val="121117"/>
+                <w:color w:val="1A1A1A"/>
                 <w:sz w:val="20"/>
               </w:rPr>
               <w:t>encima</w:t>
@@ -1253,7 +1256,7 @@
                 <w:rFonts w:ascii="Calibri" w:hAnsi="Calibri"/>
                 <w:b w:val="0"/>
                 <w:i w:val="0"/>
-                <w:color w:val="121117"/>
+                <w:color w:val="1A1A1A"/>
                 <w:sz w:val="20"/>
               </w:rPr>
               <w:t>encima de él</w:t>
@@ -1277,7 +1280,7 @@
                 <w:rFonts w:ascii="Calibri" w:hAnsi="Calibri"/>
                 <w:b w:val="0"/>
                 <w:i w:val="0"/>
-                <w:color w:val="121117"/>
+                <w:color w:val="1A1A1A"/>
                 <w:sz w:val="20"/>
               </w:rPr>
               <w:t>encima suyo / suya</w:t>
@@ -1303,7 +1306,7 @@
                 <w:rFonts w:ascii="Calibri" w:hAnsi="Calibri"/>
                 <w:b w:val="0"/>
                 <w:i w:val="0"/>
-                <w:color w:val="121117"/>
+                <w:color w:val="1A1A1A"/>
                 <w:sz w:val="20"/>
               </w:rPr>
               <w:t>debajo</w:t>
@@ -1327,7 +1330,7 @@
                 <w:rFonts w:ascii="Calibri" w:hAnsi="Calibri"/>
                 <w:b w:val="0"/>
                 <w:i w:val="0"/>
-                <w:color w:val="121117"/>
+                <w:color w:val="1A1A1A"/>
                 <w:sz w:val="20"/>
               </w:rPr>
               <w:t>debajo de nosotros</w:t>
@@ -1351,7 +1354,7 @@
                 <w:rFonts w:ascii="Calibri" w:hAnsi="Calibri"/>
                 <w:b w:val="0"/>
                 <w:i w:val="0"/>
-                <w:color w:val="121117"/>
+                <w:color w:val="1A1A1A"/>
                 <w:sz w:val="20"/>
               </w:rPr>
               <w:t>debajo nuestro</w:t>
@@ -1377,7 +1380,7 @@
                 <w:rFonts w:ascii="Calibri" w:hAnsi="Calibri"/>
                 <w:b w:val="0"/>
                 <w:i w:val="0"/>
-                <w:color w:val="121117"/>
+                <w:color w:val="1A1A1A"/>
                 <w:sz w:val="20"/>
               </w:rPr>
               <w:t>enfrente</w:t>
@@ -1401,7 +1404,7 @@
                 <w:rFonts w:ascii="Calibri" w:hAnsi="Calibri"/>
                 <w:b w:val="0"/>
                 <w:i w:val="0"/>
-                <w:color w:val="121117"/>
+                <w:color w:val="1A1A1A"/>
                 <w:sz w:val="20"/>
               </w:rPr>
               <w:t>enfrente de ti</w:t>
@@ -1425,7 +1428,7 @@
                 <w:rFonts w:ascii="Calibri" w:hAnsi="Calibri"/>
                 <w:b w:val="0"/>
                 <w:i w:val="0"/>
-                <w:color w:val="121117"/>
+                <w:color w:val="1A1A1A"/>
                 <w:sz w:val="20"/>
               </w:rPr>
               <w:t>enfrente tuyo</w:t>
@@ -1451,7 +1454,7 @@
                 <w:rFonts w:ascii="Calibri" w:hAnsi="Calibri"/>
                 <w:b w:val="0"/>
                 <w:i w:val="0"/>
-                <w:color w:val="121117"/>
+                <w:color w:val="1A1A1A"/>
                 <w:sz w:val="20"/>
               </w:rPr>
               <w:t>cerca</w:t>
@@ -1475,7 +1478,7 @@
                 <w:rFonts w:ascii="Calibri" w:hAnsi="Calibri"/>
                 <w:b w:val="0"/>
                 <w:i w:val="0"/>
-                <w:color w:val="121117"/>
+                <w:color w:val="1A1A1A"/>
                 <w:sz w:val="20"/>
               </w:rPr>
               <w:t>cerca de mí</w:t>
@@ -1499,7 +1502,7 @@
                 <w:rFonts w:ascii="Calibri" w:hAnsi="Calibri"/>
                 <w:b w:val="0"/>
                 <w:i w:val="0"/>
-                <w:color w:val="121117"/>
+                <w:color w:val="1A1A1A"/>
                 <w:sz w:val="20"/>
               </w:rPr>
               <w:t>cerca mío / mía</w:t>
@@ -1525,7 +1528,7 @@
                 <w:rFonts w:ascii="Calibri" w:hAnsi="Calibri"/>
                 <w:b w:val="0"/>
                 <w:i w:val="0"/>
-                <w:color w:val="121117"/>
+                <w:color w:val="1A1A1A"/>
                 <w:sz w:val="20"/>
               </w:rPr>
               <w:t>lejos</w:t>
@@ -1549,7 +1552,7 @@
                 <w:rFonts w:ascii="Calibri" w:hAnsi="Calibri"/>
                 <w:b w:val="0"/>
                 <w:i w:val="0"/>
-                <w:color w:val="121117"/>
+                <w:color w:val="1A1A1A"/>
                 <w:sz w:val="20"/>
               </w:rPr>
               <w:t>lejos de ella</w:t>
@@ -1573,7 +1576,7 @@
                 <w:rFonts w:ascii="Calibri" w:hAnsi="Calibri"/>
                 <w:b w:val="0"/>
                 <w:i w:val="0"/>
-                <w:color w:val="121117"/>
+                <w:color w:val="1A1A1A"/>
                 <w:sz w:val="20"/>
               </w:rPr>
               <w:t>lejos suyo</w:t>
@@ -1599,7 +1602,7 @@
                 <w:rFonts w:ascii="Calibri" w:hAnsi="Calibri"/>
                 <w:b w:val="0"/>
                 <w:i w:val="0"/>
-                <w:color w:val="121117"/>
+                <w:color w:val="1A1A1A"/>
                 <w:sz w:val="20"/>
               </w:rPr>
               <w:t>alrededor</w:t>
@@ -1623,7 +1626,7 @@
                 <w:rFonts w:ascii="Calibri" w:hAnsi="Calibri"/>
                 <w:b w:val="0"/>
                 <w:i w:val="0"/>
-                <w:color w:val="121117"/>
+                <w:color w:val="1A1A1A"/>
                 <w:sz w:val="20"/>
               </w:rPr>
               <w:t>alrededor de mí</w:t>
@@ -1647,7 +1650,7 @@
                 <w:rFonts w:ascii="Calibri" w:hAnsi="Calibri"/>
                 <w:b w:val="0"/>
                 <w:i w:val="0"/>
-                <w:color w:val="121117"/>
+                <w:color w:val="1A1A1A"/>
                 <w:sz w:val="20"/>
               </w:rPr>
               <w:t>alrededor mío (ver §3)</w:t>
@@ -1673,7 +1676,7 @@
                 <w:rFonts w:ascii="Calibri" w:hAnsi="Calibri"/>
                 <w:b w:val="0"/>
                 <w:i w:val="0"/>
-                <w:color w:val="121117"/>
+                <w:color w:val="1A1A1A"/>
                 <w:sz w:val="20"/>
               </w:rPr>
               <w:t>dentro / fuera</w:t>
@@ -1697,7 +1700,7 @@
                 <w:rFonts w:ascii="Calibri" w:hAnsi="Calibri"/>
                 <w:b w:val="0"/>
                 <w:i w:val="0"/>
-                <w:color w:val="121117"/>
+                <w:color w:val="1A1A1A"/>
                 <w:sz w:val="20"/>
               </w:rPr>
               <w:t>dentro de ti / fuera de ella</w:t>
@@ -1721,7 +1724,7 @@
                 <w:rFonts w:ascii="Calibri" w:hAnsi="Calibri"/>
                 <w:b w:val="0"/>
                 <w:i w:val="0"/>
-                <w:color w:val="121117"/>
+                <w:color w:val="1A1A1A"/>
                 <w:sz w:val="20"/>
               </w:rPr>
               <w:t>dentro tuyo / fuera suya</w:t>
@@ -1745,7 +1748,7 @@
           <w:rFonts w:ascii="Calibri" w:hAnsi="Calibri"/>
           <w:b w:val="0"/>
           <w:i/>
-          <w:color w:val="4D4C5C"/>
+          <w:color w:val="666666"/>
           <w:sz w:val="19"/>
         </w:rPr>
         <w:t>Fíjate: en amplias zonas de España y América «detrás mío» o «delante mía» están tan extendidos que suenan naturales, pero la norma culta (RAE, Fundéu) sigue recomendando «detrás de mí», «delante de mí». En un examen (DELE incluido) o en un texto escrito, usa siempre «de + pronombre».</w:t>
@@ -1765,7 +1768,7 @@
         <w:tc>
           <w:tcPr>
             <w:tcW w:type="dxa" w:w="10086"/>
-            <w:shd w:val="clear" w:color="auto" w:fill="121117"/>
+            <w:shd w:val="clear" w:color="auto" w:fill="7B1D1D"/>
             <w:tcBorders>
               <w:top w:val="single" w:sz="6" w:space="0" w:color="121117"/>
               <w:left w:val="single" w:sz="6" w:space="0" w:color="121117"/>
@@ -1810,7 +1813,7 @@
           <w:rFonts w:ascii="Calibri" w:hAnsi="Calibri"/>
           <w:b w:val="0"/>
           <w:i w:val="0"/>
-          <w:color w:val="121117"/>
+          <w:color w:val="1A1A1A"/>
           <w:sz w:val="21"/>
         </w:rPr>
         <w:t>El error resulta natural porque hay estructuras muy parecidas en las que el posesivo sí es correcto: son las que contienen un sustantivo real (lado, favor, contra, alrededor, busca…), no un adverbio.</w:t>
@@ -1831,7 +1834,7 @@
         <w:tc>
           <w:tcPr>
             <w:tcW w:type="dxa" w:w="3742"/>
-            <w:shd w:val="clear" w:color="auto" w:fill="D4920A"/>
+            <w:shd w:val="clear" w:color="auto" w:fill="1F2A44"/>
           </w:tcPr>
           <w:p>
             <w:r/>
@@ -1846,7 +1849,7 @@
                 <w:rFonts w:ascii="Calibri" w:hAnsi="Calibri"/>
                 <w:b/>
                 <w:i w:val="0"/>
-                <w:color w:val="121117"/>
+                <w:color w:val="1A1A1A"/>
                 <w:sz w:val="19"/>
               </w:rPr>
               <w:t>CORRECTO CON POSESIVO</w:t>
@@ -1856,7 +1859,7 @@
         <w:tc>
           <w:tcPr>
             <w:tcW w:type="dxa" w:w="5159"/>
-            <w:shd w:val="clear" w:color="auto" w:fill="D4920A"/>
+            <w:shd w:val="clear" w:color="auto" w:fill="1F2A44"/>
           </w:tcPr>
           <w:p>
             <w:r/>
@@ -1871,7 +1874,7 @@
                 <w:rFonts w:ascii="Calibri" w:hAnsi="Calibri"/>
                 <w:b/>
                 <w:i w:val="0"/>
-                <w:color w:val="121117"/>
+                <w:color w:val="1A1A1A"/>
                 <w:sz w:val="19"/>
               </w:rPr>
               <w:t>POR QUÉ</w:t>
@@ -1897,7 +1900,7 @@
                 <w:rFonts w:ascii="Calibri" w:hAnsi="Calibri"/>
                 <w:b w:val="0"/>
                 <w:i w:val="0"/>
-                <w:color w:val="121117"/>
+                <w:color w:val="1A1A1A"/>
                 <w:sz w:val="20"/>
               </w:rPr>
               <w:t>a mi lado</w:t>
@@ -1921,7 +1924,7 @@
                 <w:rFonts w:ascii="Calibri" w:hAnsi="Calibri"/>
                 <w:b w:val="0"/>
                 <w:i w:val="0"/>
-                <w:color w:val="121117"/>
+                <w:color w:val="1A1A1A"/>
                 <w:sz w:val="20"/>
               </w:rPr>
               <w:t>«lado» es un sustantivo</w:t>
@@ -1947,7 +1950,7 @@
                 <w:rFonts w:ascii="Calibri" w:hAnsi="Calibri"/>
                 <w:b w:val="0"/>
                 <w:i w:val="0"/>
-                <w:color w:val="121117"/>
+                <w:color w:val="1A1A1A"/>
                 <w:sz w:val="20"/>
               </w:rPr>
               <w:t>a mi favor / en mi contra</w:t>
@@ -1971,7 +1974,7 @@
                 <w:rFonts w:ascii="Calibri" w:hAnsi="Calibri"/>
                 <w:b w:val="0"/>
                 <w:i w:val="0"/>
-                <w:color w:val="121117"/>
+                <w:color w:val="1A1A1A"/>
                 <w:sz w:val="20"/>
               </w:rPr>
               <w:t>«favor» y «contra» son sustantivos</w:t>
@@ -1997,7 +2000,7 @@
                 <w:rFonts w:ascii="Calibri" w:hAnsi="Calibri"/>
                 <w:b w:val="0"/>
                 <w:i w:val="0"/>
-                <w:color w:val="121117"/>
+                <w:color w:val="1A1A1A"/>
                 <w:sz w:val="20"/>
               </w:rPr>
               <w:t>a mi alrededor</w:t>
@@ -2021,7 +2024,7 @@
                 <w:rFonts w:ascii="Calibri" w:hAnsi="Calibri"/>
                 <w:b w:val="0"/>
                 <w:i w:val="0"/>
-                <w:color w:val="121117"/>
+                <w:color w:val="1A1A1A"/>
                 <w:sz w:val="20"/>
               </w:rPr>
               <w:t>aquí «alrededor» funciona como sustantivo (también vale «alrededor de mí»)</w:t>
@@ -2047,7 +2050,7 @@
                 <w:rFonts w:ascii="Calibri" w:hAnsi="Calibri"/>
                 <w:b w:val="0"/>
                 <w:i w:val="0"/>
-                <w:color w:val="121117"/>
+                <w:color w:val="1A1A1A"/>
                 <w:sz w:val="20"/>
               </w:rPr>
               <w:t>en mi busca</w:t>
@@ -2071,7 +2074,7 @@
                 <w:rFonts w:ascii="Calibri" w:hAnsi="Calibri"/>
                 <w:b w:val="0"/>
                 <w:i w:val="0"/>
-                <w:color w:val="121117"/>
+                <w:color w:val="1A1A1A"/>
                 <w:sz w:val="20"/>
               </w:rPr>
               <w:t>«busca» es un sustantivo (fórmula fija)</w:t>
@@ -2097,7 +2100,7 @@
                 <w:rFonts w:ascii="Calibri" w:hAnsi="Calibri"/>
                 <w:b w:val="0"/>
                 <w:i w:val="0"/>
-                <w:color w:val="121117"/>
+                <w:color w:val="1A1A1A"/>
                 <w:sz w:val="20"/>
               </w:rPr>
               <w:t>en torno a mí</w:t>
@@ -2121,7 +2124,7 @@
                 <w:rFonts w:ascii="Calibri" w:hAnsi="Calibri"/>
                 <w:b w:val="0"/>
                 <w:i w:val="0"/>
-                <w:color w:val="121117"/>
+                <w:color w:val="1A1A1A"/>
                 <w:sz w:val="20"/>
               </w:rPr>
               <w:t>«torno» es un sustantivo; el pronombre va con «a», no con posesivo</w:t>
@@ -2149,7 +2152,7 @@
         <w:tc>
           <w:tcPr>
             <w:tcW w:type="dxa" w:w="10086"/>
-            <w:shd w:val="clear" w:color="auto" w:fill="121117"/>
+            <w:shd w:val="clear" w:color="auto" w:fill="7B1D1D"/>
             <w:tcBorders>
               <w:top w:val="single" w:sz="6" w:space="0" w:color="121117"/>
               <w:left w:val="single" w:sz="6" w:space="0" w:color="121117"/>
@@ -2200,7 +2203,7 @@
         <w:tc>
           <w:tcPr>
             <w:tcW w:type="dxa" w:w="2835"/>
-            <w:shd w:val="clear" w:color="auto" w:fill="C0392B"/>
+            <w:shd w:val="clear" w:color="auto" w:fill="1F2A44"/>
           </w:tcPr>
           <w:p>
             <w:r/>
@@ -2225,7 +2228,7 @@
         <w:tc>
           <w:tcPr>
             <w:tcW w:type="dxa" w:w="2835"/>
-            <w:shd w:val="clear" w:color="auto" w:fill="C0392B"/>
+            <w:shd w:val="clear" w:color="auto" w:fill="1F2A44"/>
           </w:tcPr>
           <w:p>
             <w:r/>
@@ -2250,7 +2253,7 @@
         <w:tc>
           <w:tcPr>
             <w:tcW w:type="dxa" w:w="3288"/>
-            <w:shd w:val="clear" w:color="auto" w:fill="C0392B"/>
+            <w:shd w:val="clear" w:color="auto" w:fill="1F2A44"/>
           </w:tcPr>
           <w:p>
             <w:r/>
@@ -2291,7 +2294,7 @@
                 <w:rFonts w:ascii="Calibri" w:hAnsi="Calibri"/>
                 <w:b w:val="0"/>
                 <w:i w:val="0"/>
-                <w:color w:val="121117"/>
+                <w:color w:val="1A1A1A"/>
                 <w:sz w:val="20"/>
               </w:rPr>
               <w:t>«Se sentó delante mía.»</w:t>
@@ -2315,7 +2318,7 @@
                 <w:rFonts w:ascii="Calibri" w:hAnsi="Calibri"/>
                 <w:b w:val="0"/>
                 <w:i w:val="0"/>
-                <w:color w:val="121117"/>
+                <w:color w:val="1A1A1A"/>
                 <w:sz w:val="20"/>
               </w:rPr>
               <w:t>«Se sentó delante de mí.»</w:t>
@@ -2339,7 +2342,7 @@
                 <w:rFonts w:ascii="Calibri" w:hAnsi="Calibri"/>
                 <w:b w:val="0"/>
                 <w:i w:val="0"/>
-                <w:color w:val="121117"/>
+                <w:color w:val="1A1A1A"/>
                 <w:sz w:val="20"/>
               </w:rPr>
               <w:t>adverbio + de + pronombre tónico</w:t>
@@ -2365,7 +2368,7 @@
                 <w:rFonts w:ascii="Calibri" w:hAnsi="Calibri"/>
                 <w:b w:val="0"/>
                 <w:i w:val="0"/>
-                <w:color w:val="121117"/>
+                <w:color w:val="1A1A1A"/>
                 <w:sz w:val="20"/>
               </w:rPr>
               <w:t>«El perro va detrás nuestra.»</w:t>
@@ -2389,7 +2392,7 @@
                 <w:rFonts w:ascii="Calibri" w:hAnsi="Calibri"/>
                 <w:b w:val="0"/>
                 <w:i w:val="0"/>
-                <w:color w:val="121117"/>
+                <w:color w:val="1A1A1A"/>
                 <w:sz w:val="20"/>
               </w:rPr>
               <w:t>«El perro va detrás de nosotros.»</w:t>
@@ -2413,7 +2416,7 @@
                 <w:rFonts w:ascii="Calibri" w:hAnsi="Calibri"/>
                 <w:b w:val="0"/>
                 <w:i w:val="0"/>
-                <w:color w:val="121117"/>
+                <w:color w:val="1A1A1A"/>
                 <w:sz w:val="20"/>
               </w:rPr>
               <w:t>detrás no concuerda en género ni número</w:t>
@@ -2439,7 +2442,7 @@
                 <w:rFonts w:ascii="Calibri" w:hAnsi="Calibri"/>
                 <w:b w:val="0"/>
                 <w:i w:val="0"/>
-                <w:color w:val="121117"/>
+                <w:color w:val="1A1A1A"/>
                 <w:sz w:val="20"/>
               </w:rPr>
               <w:t>«Vivo cerca suyo.»</w:t>
@@ -2463,7 +2466,7 @@
                 <w:rFonts w:ascii="Calibri" w:hAnsi="Calibri"/>
                 <w:b w:val="0"/>
                 <w:i w:val="0"/>
-                <w:color w:val="121117"/>
+                <w:color w:val="1A1A1A"/>
                 <w:sz w:val="20"/>
               </w:rPr>
               <w:t>«Vivo cerca de él / de ella.»</w:t>
@@ -2487,7 +2490,7 @@
                 <w:rFonts w:ascii="Calibri" w:hAnsi="Calibri"/>
                 <w:b w:val="0"/>
                 <w:i w:val="0"/>
-                <w:color w:val="121117"/>
+                <w:color w:val="1A1A1A"/>
                 <w:sz w:val="20"/>
               </w:rPr>
               <w:t>«suyo» es ambiguo; «de él/ella» aclara</w:t>
@@ -2513,7 +2516,7 @@
                 <w:rFonts w:ascii="Calibri" w:hAnsi="Calibri"/>
                 <w:b w:val="0"/>
                 <w:i w:val="0"/>
-                <w:color w:val="121117"/>
+                <w:color w:val="1A1A1A"/>
                 <w:sz w:val="20"/>
               </w:rPr>
               <w:t>«Ponlo encima mío.»</w:t>
@@ -2537,7 +2540,7 @@
                 <w:rFonts w:ascii="Calibri" w:hAnsi="Calibri"/>
                 <w:b w:val="0"/>
                 <w:i w:val="0"/>
-                <w:color w:val="121117"/>
+                <w:color w:val="1A1A1A"/>
                 <w:sz w:val="20"/>
               </w:rPr>
               <w:t>«Ponlo encima de mí.»</w:t>
@@ -2561,7 +2564,7 @@
                 <w:rFonts w:ascii="Calibri" w:hAnsi="Calibri"/>
                 <w:b w:val="0"/>
                 <w:i w:val="0"/>
-                <w:color w:val="121117"/>
+                <w:color w:val="1A1A1A"/>
                 <w:sz w:val="20"/>
               </w:rPr>
               <w:t>encima es adverbio, no sustantivo</w:t>
@@ -2589,7 +2592,7 @@
         <w:tc>
           <w:tcPr>
             <w:tcW w:type="dxa" w:w="10086"/>
-            <w:shd w:val="clear" w:color="auto" w:fill="121117"/>
+            <w:shd w:val="clear" w:color="auto" w:fill="7B1D1D"/>
             <w:tcBorders>
               <w:top w:val="single" w:sz="6" w:space="0" w:color="121117"/>
               <w:left w:val="single" w:sz="6" w:space="0" w:color="121117"/>
@@ -2639,7 +2642,7 @@
         <w:tc>
           <w:tcPr>
             <w:tcW w:type="dxa" w:w="4535"/>
-            <w:shd w:val="clear" w:color="auto" w:fill="D4920A"/>
+            <w:shd w:val="clear" w:color="auto" w:fill="1F2A44"/>
           </w:tcPr>
           <w:p>
             <w:r/>
@@ -2654,7 +2657,7 @@
                 <w:rFonts w:ascii="Calibri" w:hAnsi="Calibri"/>
                 <w:b/>
                 <w:i w:val="0"/>
-                <w:color w:val="121117"/>
+                <w:color w:val="1A1A1A"/>
                 <w:sz w:val="19"/>
               </w:rPr>
               <w:t>FRASE</w:t>
@@ -2664,7 +2667,7 @@
         <w:tc>
           <w:tcPr>
             <w:tcW w:type="dxa" w:w="4422"/>
-            <w:shd w:val="clear" w:color="auto" w:fill="D4920A"/>
+            <w:shd w:val="clear" w:color="auto" w:fill="1F2A44"/>
           </w:tcPr>
           <w:p>
             <w:r/>
@@ -2679,7 +2682,7 @@
                 <w:rFonts w:ascii="Calibri" w:hAnsi="Calibri"/>
                 <w:b/>
                 <w:i w:val="0"/>
-                <w:color w:val="121117"/>
+                <w:color w:val="1A1A1A"/>
                 <w:sz w:val="19"/>
               </w:rPr>
               <w:t>SIGNIFICADO / TRANSLATION</w:t>
@@ -2705,7 +2708,7 @@
                 <w:rFonts w:ascii="Calibri" w:hAnsi="Calibri"/>
                 <w:b w:val="0"/>
                 <w:i w:val="0"/>
-                <w:color w:val="121117"/>
+                <w:color w:val="1A1A1A"/>
                 <w:sz w:val="20"/>
               </w:rPr>
               <w:t>«Había una señora sentada delante de mí.»</w:t>
@@ -2729,7 +2732,7 @@
                 <w:rFonts w:ascii="Calibri" w:hAnsi="Calibri"/>
                 <w:b w:val="0"/>
                 <w:i w:val="0"/>
-                <w:color w:val="121117"/>
+                <w:color w:val="1A1A1A"/>
                 <w:sz w:val="20"/>
               </w:rPr>
               <w:t>There was a lady sitting in front of me.</w:t>
@@ -2755,7 +2758,7 @@
                 <w:rFonts w:ascii="Calibri" w:hAnsi="Calibri"/>
                 <w:b w:val="0"/>
                 <w:i w:val="0"/>
-                <w:color w:val="121117"/>
+                <w:color w:val="1A1A1A"/>
                 <w:sz w:val="20"/>
               </w:rPr>
               <w:t>«Deja la maleta detrás de ti, no en el pasillo.»</w:t>
@@ -2779,7 +2782,7 @@
                 <w:rFonts w:ascii="Calibri" w:hAnsi="Calibri"/>
                 <w:b w:val="0"/>
                 <w:i w:val="0"/>
-                <w:color w:val="121117"/>
+                <w:color w:val="1A1A1A"/>
                 <w:sz w:val="20"/>
               </w:rPr>
               <w:t>Leave the suitcase behind you, not in the aisle.</w:t>
@@ -2805,7 +2808,7 @@
                 <w:rFonts w:ascii="Calibri" w:hAnsi="Calibri"/>
                 <w:b w:val="0"/>
                 <w:i w:val="0"/>
-                <w:color w:val="121117"/>
+                <w:color w:val="1A1A1A"/>
                 <w:sz w:val="20"/>
               </w:rPr>
               <w:t>«El gato duerme encima de mí toda la noche.»</w:t>
@@ -2829,7 +2832,7 @@
                 <w:rFonts w:ascii="Calibri" w:hAnsi="Calibri"/>
                 <w:b w:val="0"/>
                 <w:i w:val="0"/>
-                <w:color w:val="121117"/>
+                <w:color w:val="1A1A1A"/>
                 <w:sz w:val="20"/>
               </w:rPr>
               <w:t>The cat sleeps on top of me all night.</w:t>
@@ -2855,7 +2858,7 @@
                 <w:rFonts w:ascii="Calibri" w:hAnsi="Calibri"/>
                 <w:b w:val="0"/>
                 <w:i w:val="0"/>
-                <w:color w:val="121117"/>
+                <w:color w:val="1A1A1A"/>
                 <w:sz w:val="20"/>
               </w:rPr>
               <w:t>«Viven muy cerca de nosotros, a dos calles.»</w:t>
@@ -2879,7 +2882,7 @@
                 <w:rFonts w:ascii="Calibri" w:hAnsi="Calibri"/>
                 <w:b w:val="0"/>
                 <w:i w:val="0"/>
-                <w:color w:val="121117"/>
+                <w:color w:val="1A1A1A"/>
                 <w:sz w:val="20"/>
               </w:rPr>
               <w:t>They live very close to us, two streets away.</w:t>
@@ -2905,7 +2908,7 @@
                 <w:rFonts w:ascii="Calibri" w:hAnsi="Calibri"/>
                 <w:b w:val="0"/>
                 <w:i w:val="0"/>
-                <w:color w:val="121117"/>
+                <w:color w:val="1A1A1A"/>
                 <w:sz w:val="20"/>
               </w:rPr>
               <w:t>«Todos se pusieron a mi favor en la reunión.»</w:t>
@@ -2929,7 +2932,7 @@
                 <w:rFonts w:ascii="Calibri" w:hAnsi="Calibri"/>
                 <w:b w:val="0"/>
                 <w:i w:val="0"/>
-                <w:color w:val="121117"/>
+                <w:color w:val="1A1A1A"/>
                 <w:sz w:val="20"/>
               </w:rPr>
               <w:t>Everyone took my side in the meeting. (posesivo correcto)</w:t>
@@ -2957,7 +2960,7 @@
         <w:tc>
           <w:tcPr>
             <w:tcW w:type="dxa" w:w="10086"/>
-            <w:shd w:val="clear" w:color="auto" w:fill="121117"/>
+            <w:shd w:val="clear" w:color="auto" w:fill="7B1D1D"/>
             <w:tcBorders>
               <w:top w:val="single" w:sz="6" w:space="0" w:color="121117"/>
               <w:left w:val="single" w:sz="6" w:space="0" w:color="121117"/>
@@ -3007,7 +3010,7 @@
         <w:tc>
           <w:tcPr>
             <w:tcW w:type="dxa" w:w="567"/>
-            <w:shd w:val="clear" w:color="auto" w:fill="1E8E4E"/>
+            <w:shd w:val="clear" w:color="auto" w:fill="1F2A44"/>
           </w:tcPr>
           <w:p>
             <w:r/>
@@ -3032,7 +3035,7 @@
         <w:tc>
           <w:tcPr>
             <w:tcW w:type="dxa" w:w="8334"/>
-            <w:shd w:val="clear" w:color="auto" w:fill="1E8E4E"/>
+            <w:shd w:val="clear" w:color="auto" w:fill="1F2A44"/>
           </w:tcPr>
           <w:p>
             <w:r/>
@@ -3073,7 +3076,7 @@
                 <w:rFonts w:ascii="Calibri" w:hAnsi="Calibri"/>
                 <w:b w:val="0"/>
                 <w:i w:val="0"/>
-                <w:color w:val="121117"/>
+                <w:color w:val="1A1A1A"/>
                 <w:sz w:val="20"/>
               </w:rPr>
               <w:t>✓</w:t>
@@ -3097,7 +3100,7 @@
                 <w:rFonts w:ascii="Calibri" w:hAnsi="Calibri"/>
                 <w:b w:val="0"/>
                 <w:i w:val="0"/>
-                <w:color w:val="121117"/>
+                <w:color w:val="1A1A1A"/>
                 <w:sz w:val="20"/>
               </w:rPr>
               <w:t>Sé que delante, detrás, encima, cerca… son adverbios y no admiten posesivo.</w:t>
@@ -3123,7 +3126,7 @@
                 <w:rFonts w:ascii="Calibri" w:hAnsi="Calibri"/>
                 <w:b w:val="0"/>
                 <w:i w:val="0"/>
-                <w:color w:val="121117"/>
+                <w:color w:val="1A1A1A"/>
                 <w:sz w:val="20"/>
               </w:rPr>
               <w:t>✓</w:t>
@@ -3147,7 +3150,7 @@
                 <w:rFonts w:ascii="Calibri" w:hAnsi="Calibri"/>
                 <w:b w:val="0"/>
                 <w:i w:val="0"/>
-                <w:color w:val="121117"/>
+                <w:color w:val="1A1A1A"/>
                 <w:sz w:val="20"/>
               </w:rPr>
               <w:t>Uso la estructura adverbio + de + pronombre tónico: delante de mí, detrás de ti.</w:t>
@@ -3173,7 +3176,7 @@
                 <w:rFonts w:ascii="Calibri" w:hAnsi="Calibri"/>
                 <w:b w:val="0"/>
                 <w:i w:val="0"/>
-                <w:color w:val="121117"/>
+                <w:color w:val="1A1A1A"/>
                 <w:sz w:val="20"/>
               </w:rPr>
               <w:t>✓</w:t>
@@ -3197,7 +3200,7 @@
                 <w:rFonts w:ascii="Calibri" w:hAnsi="Calibri"/>
                 <w:b w:val="0"/>
                 <w:i w:val="0"/>
-                <w:color w:val="121117"/>
+                <w:color w:val="1A1A1A"/>
                 <w:sz w:val="20"/>
               </w:rPr>
               <w:t>Evito sobre todo la forma femenina («delante mía»): el adverbio no tiene género.</w:t>
@@ -3223,7 +3226,7 @@
                 <w:rFonts w:ascii="Calibri" w:hAnsi="Calibri"/>
                 <w:b w:val="0"/>
                 <w:i w:val="0"/>
-                <w:color w:val="121117"/>
+                <w:color w:val="1A1A1A"/>
                 <w:sz w:val="20"/>
               </w:rPr>
               <w:t>✓</w:t>
@@ -3247,7 +3250,7 @@
                 <w:rFonts w:ascii="Calibri" w:hAnsi="Calibri"/>
                 <w:b w:val="0"/>
                 <w:i w:val="0"/>
-                <w:color w:val="121117"/>
+                <w:color w:val="1A1A1A"/>
                 <w:sz w:val="20"/>
               </w:rPr>
               <w:t>Reconozco los casos en que el posesivo sí es correcto (a mi lado, a mi favor, en mi contra).</w:t>
@@ -3275,7 +3278,7 @@
         <w:tc>
           <w:tcPr>
             <w:tcW w:type="dxa" w:w="10086"/>
-            <w:shd w:val="clear" w:color="auto" w:fill="121117"/>
+            <w:shd w:val="clear" w:color="auto" w:fill="7B1D1D"/>
             <w:tcBorders>
               <w:top w:val="single" w:sz="6" w:space="0" w:color="121117"/>
               <w:left w:val="single" w:sz="6" w:space="0" w:color="121117"/>
@@ -3324,7 +3327,7 @@
         <w:tc>
           <w:tcPr>
             <w:tcW w:type="dxa" w:w="10086"/>
-            <w:shd w:val="clear" w:color="auto" w:fill="F4F4F6"/>
+            <w:shd w:val="clear" w:color="auto" w:fill="F5F0E5"/>
             <w:tcBorders>
               <w:top w:val="single" w:sz="6" w:space="0" w:color="DDDDDD"/>
               <w:left w:val="single" w:sz="6" w:space="0" w:color="DDDDDD"/>
@@ -3345,7 +3348,7 @@
                 <w:rFonts w:ascii="Calibri" w:hAnsi="Calibri"/>
                 <w:b w:val="0"/>
                 <w:i w:val="0"/>
-                <w:color w:val="4D4C5C"/>
+                <w:color w:val="666666"/>
                 <w:sz w:val="20"/>
               </w:rPr>
               <w:t>Copia este prompt y pégalo en ChatGPT, Claude o Gemini. Practica tantas veces como quieras, a cualquier hora. Recuerda: la IA acelera tu práctica — tu profesora la hace correcta.</w:t>
@@ -3373,7 +3376,7 @@
         <w:tc>
           <w:tcPr>
             <w:tcW w:type="dxa" w:w="10086"/>
-            <w:shd w:val="clear" w:color="auto" w:fill="FBF1DE"/>
+            <w:shd w:val="clear" w:color="auto" w:fill="F4F1EA"/>
             <w:tcBorders>
               <w:top w:val="single" w:sz="6" w:space="0" w:color="D4920A"/>
               <w:left w:val="single" w:sz="6" w:space="0" w:color="D4920A"/>
@@ -3394,7 +3397,7 @@
                 <w:rFonts w:ascii="Calibri" w:hAnsi="Calibri"/>
                 <w:b/>
                 <w:i w:val="0"/>
-                <w:color w:val="D4920A"/>
+                <w:color w:val="C89B3C"/>
                 <w:sz w:val="20"/>
               </w:rPr>
               <w:t>01  PROMPT — Adverbios de lugar + pronombre</w:t>
@@ -3410,7 +3413,7 @@
                 <w:rFonts w:ascii="Calibri" w:hAnsi="Calibri"/>
                 <w:b w:val="0"/>
                 <w:i/>
-                <w:color w:val="121117"/>
+                <w:color w:val="1A1A1A"/>
                 <w:sz w:val="20"/>
               </w:rPr>
               <w:t>Actúa como mi profesor de español. Dame 10 frases con adverbios de lugar (delante, detrás, encima, debajo, cerca, lejos, enfrente) en las que yo deba completar con «de + pronombre» correctamente. Corrígeme si uso un posesivo («delante mía», «detrás tuyo») y explícame brevemente por qué no es propio del español cuidado. Nivel A2–B1.</w:t>
@@ -3438,7 +3441,7 @@
         <w:tc>
           <w:tcPr>
             <w:tcW w:type="dxa" w:w="10086"/>
-            <w:shd w:val="clear" w:color="auto" w:fill="FBEAE8"/>
+            <w:shd w:val="clear" w:color="auto" w:fill="F4F1EA"/>
             <w:tcBorders>
               <w:top w:val="single" w:sz="6" w:space="0" w:color="DDDDDD"/>
               <w:left w:val="single" w:sz="6" w:space="0" w:color="DDDDDD"/>
@@ -3459,7 +3462,7 @@
                 <w:rFonts w:ascii="Calibri" w:hAnsi="Calibri"/>
                 <w:b/>
                 <w:i w:val="0"/>
-                <w:color w:val="121117"/>
+                <w:color w:val="1A1A1A"/>
                 <w:sz w:val="19"/>
               </w:rPr>
               <w:t>Aviso importante: la IA a veces produce explicaciones incompletas o incorrectas sobre gramática española. Si algo contradice lo que has aprendido aquí, consulta a tu profesora. La IA es el gimnasio — te da repeticiones ilimitadas. El profesor es el entrenador — te dice si estás haciendo el ejercicio bien.</w:t>
@@ -3487,7 +3490,7 @@
         <w:tc>
           <w:tcPr>
             <w:tcW w:type="dxa" w:w="10086"/>
-            <w:shd w:val="clear" w:color="auto" w:fill="121117"/>
+            <w:shd w:val="clear" w:color="auto" w:fill="7B1D1D"/>
             <w:tcBorders>
               <w:top w:val="single" w:sz="6" w:space="0" w:color="121117"/>
               <w:left w:val="single" w:sz="6" w:space="0" w:color="121117"/>
@@ -3536,7 +3539,7 @@
         <w:tc>
           <w:tcPr>
             <w:tcW w:type="dxa" w:w="10086"/>
-            <w:shd w:val="clear" w:color="auto" w:fill="F4F4F6"/>
+            <w:shd w:val="clear" w:color="auto" w:fill="F5F0E5"/>
             <w:tcBorders>
               <w:top w:val="single" w:sz="6" w:space="0" w:color="DDDDDD"/>
               <w:left w:val="single" w:sz="6" w:space="0" w:color="DDDDDD"/>
@@ -3557,7 +3560,7 @@
                 <w:rFonts w:ascii="Calibri" w:hAnsi="Calibri"/>
                 <w:b w:val="0"/>
                 <w:i w:val="0"/>
-                <w:color w:val="4D4C5C"/>
+                <w:color w:val="666666"/>
                 <w:sz w:val="20"/>
               </w:rPr>
               <w:t>Este PDF es un adelanto gratuito del vídeo corto. La serie completa de «errores frecuentes» —también los que cometen los nativos— estará disponible en el curso de Español cuidado y expresión.</w:t>
@@ -3586,7 +3589,7 @@
         <w:tc>
           <w:tcPr>
             <w:tcW w:type="dxa" w:w="3402"/>
-            <w:shd w:val="clear" w:color="auto" w:fill="D4920A"/>
+            <w:shd w:val="clear" w:color="auto" w:fill="1F2A44"/>
           </w:tcPr>
           <w:p>
             <w:r/>
@@ -3601,7 +3604,7 @@
                 <w:rFonts w:ascii="Calibri" w:hAnsi="Calibri"/>
                 <w:b/>
                 <w:i w:val="0"/>
-                <w:color w:val="121117"/>
+                <w:color w:val="1A1A1A"/>
                 <w:sz w:val="19"/>
               </w:rPr>
               <w:t>EN OTRAS LECCIONES</w:t>
@@ -3611,7 +3614,7 @@
         <w:tc>
           <w:tcPr>
             <w:tcW w:type="dxa" w:w="5499"/>
-            <w:shd w:val="clear" w:color="auto" w:fill="D4920A"/>
+            <w:shd w:val="clear" w:color="auto" w:fill="1F2A44"/>
           </w:tcPr>
           <w:p>
             <w:r/>
@@ -3626,7 +3629,7 @@
                 <w:rFonts w:ascii="Calibri" w:hAnsi="Calibri"/>
                 <w:b/>
                 <w:i w:val="0"/>
-                <w:color w:val="121117"/>
+                <w:color w:val="1A1A1A"/>
                 <w:sz w:val="19"/>
               </w:rPr>
               <w:t>Spanish Lessons with Mercedes</w:t>
@@ -3652,7 +3655,7 @@
                 <w:rFonts w:ascii="Calibri" w:hAnsi="Calibri"/>
                 <w:b w:val="0"/>
                 <w:i w:val="0"/>
-                <w:color w:val="121117"/>
+                <w:color w:val="1A1A1A"/>
                 <w:sz w:val="20"/>
               </w:rPr>
               <w:t>ALANTE / ADELANTE</w:t>
@@ -3676,7 +3679,7 @@
                 <w:rFonts w:ascii="Calibri" w:hAnsi="Calibri"/>
                 <w:b w:val="0"/>
                 <w:i w:val="0"/>
-                <w:color w:val="121117"/>
+                <w:color w:val="1A1A1A"/>
                 <w:sz w:val="20"/>
               </w:rPr>
               <w:t>«Ponte más alante» → «más adelante». Otro error del habla rápida. A2–B1.</w:t>
@@ -3702,7 +3705,7 @@
                 <w:rFonts w:ascii="Calibri" w:hAnsi="Calibri"/>
                 <w:b w:val="0"/>
                 <w:i w:val="0"/>
-                <w:color w:val="121117"/>
+                <w:color w:val="1A1A1A"/>
                 <w:sz w:val="20"/>
               </w:rPr>
               <w:t>ESPIRAR / EXPIRAR</w:t>
@@ -3726,7 +3729,7 @@
                 <w:rFonts w:ascii="Calibri" w:hAnsi="Calibri"/>
                 <w:b w:val="0"/>
                 <w:i w:val="0"/>
-                <w:color w:val="121117"/>
+                <w:color w:val="1A1A1A"/>
                 <w:sz w:val="20"/>
               </w:rPr>
               <w:t>Una sola letra que lo cambia todo: soltar el aire vs. morir o caducar.</w:t>
@@ -3752,7 +3755,7 @@
                 <w:rFonts w:ascii="Calibri" w:hAnsi="Calibri"/>
                 <w:b w:val="0"/>
                 <w:i w:val="0"/>
-                <w:color w:val="121117"/>
+                <w:color w:val="1A1A1A"/>
                 <w:sz w:val="20"/>
               </w:rPr>
               <w:t>ANDAR — pretérito irregular</w:t>
@@ -3776,7 +3779,7 @@
                 <w:rFonts w:ascii="Calibri" w:hAnsi="Calibri"/>
                 <w:b w:val="0"/>
                 <w:i w:val="0"/>
-                <w:color w:val="121117"/>
+                <w:color w:val="1A1A1A"/>
                 <w:sz w:val="20"/>
               </w:rPr>
               <w:t>«Ayer andé» → «ayer anduve». La misma raíz que estar. A2–B1.</w:t>
@@ -3802,7 +3805,7 @@
                 <w:rFonts w:ascii="Calibri" w:hAnsi="Calibri"/>
                 <w:b w:val="0"/>
                 <w:i w:val="0"/>
-                <w:color w:val="121117"/>
+                <w:color w:val="1A1A1A"/>
                 <w:sz w:val="20"/>
               </w:rPr>
               <w:t>Verbos con preposición</w:t>
@@ -3826,7 +3829,7 @@
                 <w:rFonts w:ascii="Calibri" w:hAnsi="Calibri"/>
                 <w:b w:val="0"/>
                 <w:i w:val="0"/>
-                <w:color w:val="121117"/>
+                <w:color w:val="1A1A1A"/>
                 <w:sz w:val="20"/>
               </w:rPr>
               <w:t>Acordarse DE, confiar EN, soñar CON… errores por interferencia de otro idioma.</w:t>
@@ -3850,7 +3853,7 @@
           <w:rFonts w:ascii="Calibri" w:hAnsi="Calibri"/>
           <w:b w:val="0"/>
           <w:i/>
-          <w:color w:val="4D4C5C"/>
+          <w:color w:val="666666"/>
           <w:sz w:val="19"/>
         </w:rPr>
         <w:t>Suscríbete al canal Spanish Lessons with Mercedes para no perderte ninguna lección.</w:t>
@@ -3866,20 +3869,303 @@
           <w:rFonts w:ascii="Calibri" w:hAnsi="Calibri"/>
           <w:b w:val="0"/>
           <w:i w:val="0"/>
-          <w:color w:val="9B9AAB"/>
+          <w:color w:val="666666"/>
           <w:sz w:val="16"/>
         </w:rPr>
         <w:t>spanishmercedes.com  ·  © Spanish Lessons with Mercedes</w:t>
       </w:r>
     </w:p>
     <w:sectPr>
-      <w:pgSz w:w="12240" w:h="15840"/>
-      <w:pgMar w:top="907" w:right="1077" w:bottom="907" w:left="1077" w:header="720" w:footer="720" w:gutter="0"/>
+      <w:headerReference w:type="default" r:id="rId9"/>
+      <w:footerReference w:type="default" r:id="rId10"/>
+      <w:pgSz w:w="11906" w:h="16838"/>
+      <w:pgMar w:top="1700" w:right="1019" w:bottom="1019" w:left="1019" w:header="708" w:footer="708" w:gutter="0"/>
       <w:cols w:space="720"/>
       <w:docGrid w:linePitch="360"/>
     </w:sectPr>
   </w:body>
 </w:document>
+</file>
+
+<file path=word/footer1.xml><?xml version="1.0" encoding="utf-8"?>
+<w:ftr xmlns:wpc="http://schemas.microsoft.com/office/word/2010/wordprocessingCanvas" xmlns:cx="http://schemas.microsoft.com/office/drawing/2014/chartex" xmlns:cx1="http://schemas.microsoft.com/office/drawing/2015/9/8/chartex" xmlns:cx2="http://schemas.microsoft.com/office/drawing/2015/10/21/chartex" xmlns:cx3="http://schemas.microsoft.com/office/drawing/2016/5/9/chartex" xmlns:cx4="http://schemas.microsoft.com/office/drawing/2016/5/10/chartex" xmlns:cx5="http://schemas.microsoft.com/office/drawing/2016/5/11/chartex" xmlns:cx6="http://schemas.microsoft.com/office/drawing/2016/5/12/chartex" xmlns:cx7="http://schemas.microsoft.com/office/drawing/2016/5/13/chartex" xmlns:cx8="http://schemas.microsoft.com/office/drawing/2016/5/14/chartex" xmlns:mc="http://schemas.openxmlformats.org/markup-compatibility/2006" xmlns:aink="http://schemas.microsoft.com/office/drawing/2016/ink" xmlns:am3d="http://schemas.microsoft.com/office/drawing/2017/model3d" xmlns:o="urn:schemas-microsoft-com:office:office" xmlns:oel="http://schemas.microsoft.com/office/2019/extlst" xmlns:r="http://schemas.openxmlformats.org/officeDocument/2006/relationships" xmlns:m="http://schemas.openxmlformats.org/officeDocument/2006/math" xmlns:v="urn:schemas-microsoft-com:vml" xmlns:wp14="http://schemas.microsoft.com/office/word/2010/wordprocessingDrawing" xmlns:wp="http://schemas.openxmlformats.org/drawingml/2006/wordprocessingDrawing" xmlns:w10="urn:schemas-microsoft-com:office:word" xmlns:w="http://schemas.openxmlformats.org/wordprocessingml/2006/main" xmlns:w14="http://schemas.microsoft.com/office/word/2010/wordml" xmlns:w15="http://schemas.microsoft.com/office/word/2012/wordml" xmlns:w16cei="http://schemas.microsoft.com/office/word/2026/wordml/cei" xmlns:w16cex="http://schemas.microsoft.com/office/word/2018/wordml/cex" xmlns:w16cid="http://schemas.microsoft.com/office/word/2016/wordml/cid" xmlns:w16="http://schemas.microsoft.com/office/word/2018/wordml" xmlns:w16du="http://schemas.microsoft.com/office/word/2023/wordml/word16du" xmlns:w16sdtdh="http://schemas.microsoft.com/office/word/2020/wordml/sdtdatahash" xmlns:w16sdtfl="http://schemas.microsoft.com/office/word/2024/wordml/sdtformatlock" xmlns:w16se="http://schemas.microsoft.com/office/word/2015/wordml/symex" xmlns:wpg="http://schemas.microsoft.com/office/word/2010/wordprocessingGroup" xmlns:wpi="http://schemas.microsoft.com/office/word/2010/wordprocessingInk" xmlns:wne="http://schemas.microsoft.com/office/word/2006/wordml" xmlns:wps="http://schemas.microsoft.com/office/word/2010/wordprocessingShape" mc:Ignorable="w14 w15 w16se w16cid w16 w16cex w16sdtdh w16sdtfl w16du wp14">
+  <w:p>
+    <w:pPr>
+      <w:jc w:val="center"/>
+      <w:rPr>
+        <w:lang w:val="en-GB"/>
+      </w:rPr>
+    </w:pPr>
+    <w:r>
+      <w:rPr>
+        <w:lang w:val="en-GB"/>
+      </w:rPr>
+      <w:t>spanishmercedes.com · © Spanish Lessons with Mercedes</w:t>
+    </w:r>
+  </w:p>
+</w:ftr>
+</file>
+
+<file path=word/header1.xml><?xml version="1.0" encoding="utf-8"?>
+<w:hdr xmlns:wpc="http://schemas.microsoft.com/office/word/2010/wordprocessingCanvas" xmlns:cx="http://schemas.microsoft.com/office/drawing/2014/chartex" xmlns:cx1="http://schemas.microsoft.com/office/drawing/2015/9/8/chartex" xmlns:cx2="http://schemas.microsoft.com/office/drawing/2015/10/21/chartex" xmlns:cx3="http://schemas.microsoft.com/office/drawing/2016/5/9/chartex" xmlns:cx4="http://schemas.microsoft.com/office/drawing/2016/5/10/chartex" xmlns:cx5="http://schemas.microsoft.com/office/drawing/2016/5/11/chartex" xmlns:cx6="http://schemas.microsoft.com/office/drawing/2016/5/12/chartex" xmlns:cx7="http://schemas.microsoft.com/office/drawing/2016/5/13/chartex" xmlns:cx8="http://schemas.microsoft.com/office/drawing/2016/5/14/chartex" xmlns:mc="http://schemas.openxmlformats.org/markup-compatibility/2006" xmlns:aink="http://schemas.microsoft.com/office/drawing/2016/ink" xmlns:am3d="http://schemas.microsoft.com/office/drawing/2017/model3d" xmlns:o="urn:schemas-microsoft-com:office:office" xmlns:oel="http://schemas.microsoft.com/office/2019/extlst" xmlns:r="http://schemas.openxmlformats.org/officeDocument/2006/relationships" xmlns:m="http://schemas.openxmlformats.org/officeDocument/2006/math" xmlns:v="urn:schemas-microsoft-com:vml" xmlns:wp14="http://schemas.microsoft.com/office/word/2010/wordprocessingDrawing" xmlns:wp="http://schemas.openxmlformats.org/drawingml/2006/wordprocessingDrawing" xmlns:w10="urn:schemas-microsoft-com:office:word" xmlns:w="http://schemas.openxmlformats.org/wordprocessingml/2006/main" xmlns:w14="http://schemas.microsoft.com/office/word/2010/wordml" xmlns:w15="http://schemas.microsoft.com/office/word/2012/wordml" xmlns:w16cei="http://schemas.microsoft.com/office/word/2026/wordml/cei" xmlns:w16cex="http://schemas.microsoft.com/office/word/2018/wordml/cex" xmlns:w16cid="http://schemas.microsoft.com/office/word/2016/wordml/cid" xmlns:w16="http://schemas.microsoft.com/office/word/2018/wordml" xmlns:w16du="http://schemas.microsoft.com/office/word/2023/wordml/word16du" xmlns:w16sdtdh="http://schemas.microsoft.com/office/word/2020/wordml/sdtdatahash" xmlns:w16sdtfl="http://schemas.microsoft.com/office/word/2024/wordml/sdtformatlock" xmlns:w16se="http://schemas.microsoft.com/office/word/2015/wordml/symex" xmlns:wpg="http://schemas.microsoft.com/office/word/2010/wordprocessingGroup" xmlns:wpi="http://schemas.microsoft.com/office/word/2010/wordprocessingInk" xmlns:wne="http://schemas.microsoft.com/office/word/2006/wordml" xmlns:wps="http://schemas.microsoft.com/office/word/2010/wordprocessingShape" mc:Ignorable="w14 w15 w16se w16cid w16 w16cex w16sdtdh w16sdtfl w16du wp14">
+  <w:p>
+    <w:pPr>
+      <w:tabs>
+        <w:tab w:val="right" w:pos="9868"/>
+      </w:tabs>
+      <w:rPr>
+        <w:lang w:val="en-GB"/>
+      </w:rPr>
+    </w:pPr>
+    <w:r>
+      <w:rPr>
+        <w:noProof/>
+      </w:rPr>
+      <w:drawing>
+        <wp:anchor distT="0" distB="0" distL="114300" distR="114300" simplePos="0" relativeHeight="251658240" behindDoc="1" locked="0" layoutInCell="1" allowOverlap="1" wp14:anchorId="515387A7" wp14:editId="141EE7A7">
+          <wp:simplePos x="0" y="0"/>
+          <wp:positionH relativeFrom="column">
+            <wp:posOffset>-94615</wp:posOffset>
+          </wp:positionH>
+          <wp:positionV relativeFrom="paragraph">
+            <wp:posOffset>-246380</wp:posOffset>
+          </wp:positionV>
+          <wp:extent cx="879508" cy="819150"/>
+          <wp:effectExtent l="0" t="0" r="0" b="0"/>
+          <wp:wrapTight wrapText="bothSides">
+            <wp:wrapPolygon edited="0">
+              <wp:start x="7486" y="0"/>
+              <wp:lineTo x="4679" y="1005"/>
+              <wp:lineTo x="936" y="5526"/>
+              <wp:lineTo x="936" y="11051"/>
+              <wp:lineTo x="7018" y="16074"/>
+              <wp:lineTo x="0" y="16074"/>
+              <wp:lineTo x="0" y="21098"/>
+              <wp:lineTo x="7954" y="21098"/>
+              <wp:lineTo x="12165" y="21098"/>
+              <wp:lineTo x="21054" y="21098"/>
+              <wp:lineTo x="21054" y="16074"/>
+              <wp:lineTo x="14036" y="16074"/>
+              <wp:lineTo x="20586" y="10549"/>
+              <wp:lineTo x="20586" y="6028"/>
+              <wp:lineTo x="17311" y="2009"/>
+              <wp:lineTo x="13568" y="0"/>
+              <wp:lineTo x="7486" y="0"/>
+            </wp:wrapPolygon>
+          </wp:wrapTight>
+          <wp:docPr id="1446228601" name="Imagen 1446228601"/>
+          <wp:cNvGraphicFramePr>
+            <a:graphicFrameLocks xmlns:a="http://schemas.openxmlformats.org/drawingml/2006/main" noChangeAspect="1"/>
+          </wp:cNvGraphicFramePr>
+          <a:graphic xmlns:a="http://schemas.openxmlformats.org/drawingml/2006/main">
+            <a:graphicData uri="http://schemas.openxmlformats.org/drawingml/2006/picture">
+              <pic:pic xmlns:pic="http://schemas.openxmlformats.org/drawingml/2006/picture">
+                <pic:nvPicPr>
+                  <pic:cNvPr id="0" name=""/>
+                  <pic:cNvPicPr>
+                    <a:picLocks noChangeAspect="1" noChangeArrowheads="1"/>
+                  </pic:cNvPicPr>
+                </pic:nvPicPr>
+                <pic:blipFill>
+                  <a:blip r:embed="rId1">
+                    <a:extLst>
+                      <a:ext uri="{28A0092B-C50C-407E-A947-70E740481C1C}">
+                        <a14:useLocalDpi xmlns:a14="http://schemas.microsoft.com/office/drawing/2010/main" val="0"/>
+                      </a:ext>
+                    </a:extLst>
+                  </a:blip>
+                  <a:srcRect/>
+                  <a:stretch>
+                    <a:fillRect/>
+                  </a:stretch>
+                </pic:blipFill>
+                <pic:spPr bwMode="auto">
+                  <a:xfrm>
+                    <a:off x="0" y="0"/>
+                    <a:ext cx="879508" cy="819150"/>
+                  </a:xfrm>
+                  <a:prstGeom prst="rect">
+                    <a:avLst/>
+                  </a:prstGeom>
+                </pic:spPr>
+              </pic:pic>
+            </a:graphicData>
+          </a:graphic>
+        </wp:anchor>
+      </w:drawing>
+    </w:r>
+    <w:r>
+      <w:rPr>
+        <w:rFonts w:ascii="Arial" w:eastAsia="Arial" w:hAnsi="Arial" w:cs="Arial"/>
+        <w:b/>
+        <w:bCs/>
+        <w:color w:val="1B2A4A"/>
+        <w:lang w:val="en-GB"/>
+      </w:rPr>
+      <w:t xml:space="preserve">    </w:t>
+    </w:r>
+    <w:r>
+      <w:rPr>
+        <w:rFonts w:ascii="Arial" w:eastAsia="Arial" w:hAnsi="Arial" w:cs="Arial"/>
+        <w:b/>
+        <w:bCs/>
+        <w:color w:val="1B2A4A"/>
+        <w:lang w:val="en-GB"/>
+      </w:rPr>
+      <w:t xml:space="preserve"> SPANISH </w:t>
+    </w:r>
+    <w:proofErr w:type="gramStart"/>
+    <w:r>
+      <w:rPr>
+        <w:rFonts w:ascii="Arial" w:eastAsia="Arial" w:hAnsi="Arial" w:cs="Arial"/>
+        <w:b/>
+        <w:bCs/>
+        <w:color w:val="1B2A4A"/>
+        <w:lang w:val="en-GB"/>
+      </w:rPr>
+      <w:t>LESSONS  with</w:t>
+    </w:r>
+    <w:proofErr w:type="gramEnd"/>
+    <w:r>
+      <w:rPr>
+        <w:rFonts w:ascii="Arial" w:eastAsia="Arial" w:hAnsi="Arial" w:cs="Arial"/>
+        <w:b/>
+        <w:bCs/>
+        <w:color w:val="1B2A4A"/>
+        <w:lang w:val="en-GB"/>
+      </w:rPr>
+      <w:t xml:space="preserve"> Mercede</w:t>
+    </w:r>
+    <w:r>
+      <w:rPr>
+        <w:rFonts w:ascii="Arial" w:eastAsia="Arial" w:hAnsi="Arial" w:cs="Arial"/>
+        <w:b/>
+        <w:bCs/>
+        <w:color w:val="1B2A4A"/>
+        <w:lang w:val="en-GB"/>
+      </w:rPr>
+      <w:t>s</w:t>
+    </w:r>
+    <w:r>
+      <w:rPr>
+        <w:lang w:val="en-GB"/>
+      </w:rPr>
+      <w:tab/>
+    </w:r>
+    <w:r>
+      <w:rPr>
+        <w:rFonts w:ascii="Arial" w:eastAsia="Arial" w:hAnsi="Arial" w:cs="Arial"/>
+        <w:color w:val="2C2C2C"/>
+        <w:sz w:val="17"/>
+        <w:szCs w:val="17"/>
+        <w:lang w:val="en-GB"/>
+      </w:rPr>
+      <w:t>spa</w:t>
+    </w:r>
+    <w:r>
+      <w:rPr>
+        <w:rFonts w:ascii="Arial" w:eastAsia="Arial" w:hAnsi="Arial" w:cs="Arial"/>
+        <w:color w:val="2C2C2C"/>
+        <w:sz w:val="17"/>
+        <w:szCs w:val="17"/>
+        <w:lang w:val="en-GB"/>
+      </w:rPr>
+      <w:t>nishlessonswithmercedes@gmail.com</w:t>
+    </w:r>
+  </w:p>
+  <w:p>
+    <w:pPr>
+      <w:pBdr>
+        <w:bottom w:val="single" w:sz="3" w:space="7" w:color="BBBBBB"/>
+      </w:pBdr>
+      <w:tabs>
+        <w:tab w:val="right" w:pos="9868"/>
+      </w:tabs>
+      <w:spacing w:after="100"/>
+    </w:pPr>
+    <w:r>
+      <w:rPr>
+        <w:rFonts w:ascii="Arial" w:eastAsia="Arial" w:hAnsi="Arial" w:cs="Arial"/>
+        <w:i/>
+        <w:iCs/>
+        <w:color w:val="2C2C2C"/>
+        <w:sz w:val="17"/>
+        <w:szCs w:val="17"/>
+        <w:lang w:val="en-GB"/>
+      </w:rPr>
+      <w:t xml:space="preserve">     </w:t>
+    </w:r>
+    <w:r>
+      <w:rPr>
+        <w:rFonts w:ascii="Arial" w:eastAsia="Arial" w:hAnsi="Arial" w:cs="Arial"/>
+        <w:i/>
+        <w:iCs/>
+        <w:color w:val="2C2C2C"/>
+        <w:sz w:val="17"/>
+        <w:szCs w:val="17"/>
+      </w:rPr>
+      <w:t>El canal de español abierto al mundo</w:t>
+    </w:r>
+    <w:r>
+      <w:tab/>
+    </w:r>
+    <w:r>
+      <w:rPr>
+        <w:rFonts w:ascii="Arial" w:eastAsia="Arial" w:hAnsi="Arial" w:cs="Arial"/>
+        <w:color w:val="2C2C2C"/>
+        <w:sz w:val="17"/>
+        <w:szCs w:val="17"/>
+      </w:rPr>
+      <w:t xml:space="preserve">pág. </w:t>
+    </w:r>
+    <w:r>
+      <w:rPr>
+        <w:rFonts w:ascii="Arial" w:eastAsia="Arial" w:hAnsi="Arial" w:cs="Arial"/>
+        <w:color w:val="2C2C2C"/>
+        <w:sz w:val="17"/>
+        <w:szCs w:val="17"/>
+      </w:rPr>
+      <w:fldChar w:fldCharType="begin"/>
+    </w:r>
+    <w:r>
+      <w:rPr>
+        <w:rFonts w:ascii="Arial" w:eastAsia="Arial" w:hAnsi="Arial" w:cs="Arial"/>
+        <w:color w:val="2C2C2C"/>
+        <w:sz w:val="17"/>
+        <w:szCs w:val="17"/>
+      </w:rPr>
+      <w:instrText>PAGE</w:instrText>
+    </w:r>
+    <w:r>
+      <w:rPr>
+        <w:rFonts w:ascii="Arial" w:eastAsia="Arial" w:hAnsi="Arial" w:cs="Arial"/>
+        <w:color w:val="2C2C2C"/>
+        <w:sz w:val="17"/>
+        <w:szCs w:val="17"/>
+      </w:rPr>
+      <w:fldChar w:fldCharType="separate"/>
+    </w:r>
+    <w:r>
+      <w:rPr>
+        <w:rFonts w:ascii="Arial" w:eastAsia="Arial" w:hAnsi="Arial" w:cs="Arial"/>
+        <w:noProof/>
+        <w:color w:val="2C2C2C"/>
+        <w:sz w:val="17"/>
+        <w:szCs w:val="17"/>
+      </w:rPr>
+      <w:t>1</w:t>
+    </w:r>
+    <w:r>
+      <w:rPr>
+        <w:rFonts w:ascii="Arial" w:eastAsia="Arial" w:hAnsi="Arial" w:cs="Arial"/>
+        <w:color w:val="2C2C2C"/>
+        <w:sz w:val="17"/>
+        <w:szCs w:val="17"/>
+      </w:rPr>
+      <w:fldChar w:fldCharType="end"/>
+    </w:r>
+  </w:p>
+</w:hdr>
 </file>
 
 <file path=word/numbering.xml><?xml version="1.0" encoding="utf-8"?>

</xml_diff>